<commit_message>
Wire primary sources into Unit 1 workbook; purge US-History leaks from docx builders
- Generated BUILD/unit1/analysis/unit1_images.json (flat anchor records
  derived from the verified deck manifest + sourcing JSON; SVG sources use
  their rasterized PNG for docx). Unit 1 Student Workbook now embeds all 8
  available cited primary sources (GC.04 pending its re-export).
- Fixed cross-product leaks the earlier scan missed: workbook reading-type
  line and cover keywords/blurbs referenced the US-History edition
  ('History Hack', 'Gilded Age', 'industrialization', 'U.S. history').
  These now use the edition BRAND and Government & Civics terms.
- Verified: all 8 Unit 1 deliverables scan clean of History Hack /
  Williamson / US.01 / George Jordan / Homestead / Gilded / industrialization.

Co-Authored-By: Claude Opus 4.8 <noreply@anthropic.com>
Claude-Session: https://claude.ai/code/session_01DHdLjiiJeW6A83FcYRQ3qv
</commit_message>
<xml_diff>
--- a/courses/foundations-constitutional-government/BUILD/unit1/deliverables/Unit1_Cover_Assessment_Book.docx
+++ b/courses/foundations-constitutional-government/BUILD/unit1/deliverables/Unit1_Cover_Assessment_Book.docx
@@ -1229,7 +1229,7 @@
           <w:caps w:val="false"/>
           <w:rFonts w:ascii="Calibri" w:cs="Calibri" w:eastAsia="Calibri" w:hAnsi="Calibri"/>
         </w:rPr>
-        <w:t xml:space="preserve">Every item is pulled from the History Hack question bank; positions de-biased and synced across surfaces.</w:t>
+        <w:t xml:space="preserve">Every item is pulled from the Government Hack question bank; positions de-biased and synced across surfaces.</w:t>
       </w:r>
     </w:p>
     <w:p>
@@ -3263,7 +3263,7 @@
                 <w:caps w:val="false"/>
                 <w:rFonts w:ascii="Calibri" w:cs="Calibri" w:eastAsia="Calibri" w:hAnsi="Calibri"/>
               </w:rPr>
-              <w:t xml:space="preserve">assessment, formative, summative, parallel forms, item analysis, reteach, DOK, reporting category, U.S. history, TCAP</w:t>
+              <w:t xml:space="preserve">assessment, formative, summative, parallel forms, item analysis, reteach, DOK, reporting category, U.S. Government &amp; Civics, TCAP</w:t>
             </w:r>
           </w:p>
         </w:tc>
@@ -3306,7 +3306,7 @@
           <w:caps w:val="false"/>
           <w:rFonts w:ascii="Calibri" w:cs="Calibri" w:eastAsia="Calibri" w:hAnsi="Calibri"/>
         </w:rPr>
-        <w:t xml:space="preserve">The Unit 1 Assessment Book gives you a formative checkpoint for each standard, two parallel summative forms (A and B) for pre/post or retakes, and a full teacher answer key with item analysis and reteach routing. Every item is drawn from the History Hack question bank, de-biased, and labeled classroom-formative · pre-field-test. Reproduce the student sections; keep the key section for yourself.</w:t>
+        <w:t xml:space="preserve">The Unit 1 Assessment Book gives you a formative checkpoint for each standard, two parallel summative forms (A and B) for pre/post or retakes, and a full teacher answer key with item analysis and reteach routing. Every item is drawn from the Government Hack question bank, de-biased, and labeled classroom-formative · pre-field-test. Reproduce the student sections; keep the key section for yourself.</w:t>
       </w:r>
     </w:p>
     <w:sectPr>

</xml_diff>